<commit_message>
docs: refinement of erx integration guide (#10915)
* docs: refinement of erx integration guide

* [autofix.ci] apply automated fixes

---------

Co-authored-by: autofix-ci[bot] <114827586+autofix-ci[bot]@users.noreply.github.com>
</commit_message>
<xml_diff>
--- a/packages/docs/static/decision-guides/e-prescribe.docx
+++ b/packages/docs/static/decision-guides/e-prescribe.docx
@@ -49,7 +49,7 @@
         </w:drawing>
       </w:r>
     </w:p>
-    <w:bookmarkStart w:id="49" w:name="e-prescribe-decision-guide"/>
+    <w:bookmarkStart w:id="50" w:name="e-prescribe-decision-guide"/>
     <w:p>
       <w:pPr>
         <w:pStyle w:val="Heading1"/>
@@ -106,7 +106,21 @@
         <w:pStyle w:val="BodyText"/>
       </w:pPr>
       <w:r>
-        <w:t xml:space="preserve">E-prescribing in Medplum runs through an integration with an e-prescribing vendor connected to the SureScripts network. This space is less about the FHIR data model than a sequence of</w:t>
+        <w:t xml:space="preserve">E-prescribing in Medplum is part of the</w:t>
+      </w:r>
+      <w:r>
+        <w:t xml:space="preserve"> </w:t>
+      </w:r>
+      <w:hyperlink r:id="rId24">
+        <w:r>
+          <w:rPr>
+            <w:rStyle w:val="Hyperlink"/>
+          </w:rPr>
+          <w:t xml:space="preserve">Medplum EHR</w:t>
+        </w:r>
+      </w:hyperlink>
+      <w:r>
+        <w:t xml:space="preserve">, not a standalone product. It runs through an integration with an e-prescribing vendor connected to the SureScripts network. This space is less about the FHIR data model than a sequence of</w:t>
       </w:r>
       <w:r>
         <w:t xml:space="preserve"> </w:t>
@@ -119,10 +133,10 @@
         <w:t xml:space="preserve">integration and enrollment decisions</w:t>
       </w:r>
       <w:r>
-        <w:t xml:space="preserve">: how much prescribing UI you build, whether you send controlled substances, and how prescribers get enrolled and verified. This guide moves from those high-level decisions down to feature detail.</w:t>
-      </w:r>
-    </w:p>
-    <w:bookmarkStart w:id="24" w:name="section-1-use-case-participants"/>
+        <w:t xml:space="preserve">: whether prescribing uses the vendor’s hosted flow or a custom workflow, whether you send controlled substances, and how prescribers get enrolled and verified. This guide moves from those high-level decisions down to feature detail.</w:t>
+      </w:r>
+    </w:p>
+    <w:bookmarkStart w:id="25" w:name="section-1-use-case-participants"/>
     <w:p>
       <w:pPr>
         <w:pStyle w:val="Heading2"/>
@@ -140,7 +154,7 @@
           <w:iCs/>
           <w:i/>
         </w:rPr>
-        <w:t xml:space="preserve">Two of these — what you prescribe (1.1) and how much you build (1.2) — cascade into most of Section 3. Land them first.</w:t>
+        <w:t xml:space="preserve">Two of these — what you prescribe (1.1) and which workflow you use (1.2) — cascade into most of Section 3. Land them first.</w:t>
       </w:r>
     </w:p>
     <w:p>
@@ -235,7 +249,7 @@
           <w:bCs/>
           <w:b/>
         </w:rPr>
-        <w:t xml:space="preserve">1.2 How much of the prescribing experience do you want to build?</w:t>
+        <w:t xml:space="preserve">1.2 Do you want the hosted flow, or a custom workflow?</w:t>
       </w:r>
     </w:p>
     <w:p>
@@ -257,7 +271,7 @@
         <w:t xml:space="preserve"> </w:t>
       </w:r>
       <w:r>
-        <w:t xml:space="preserve">— embed the vendor’s prescribing UI. Minimal build; drug search, dosing, pharmacy, and send all happen inside the vendor’s screens.</w:t>
+        <w:t xml:space="preserve">— embed the vendor’s prescribing screens. Drug search, dosing, pharmacy, and send all happen inside the vendor’s flow.</w:t>
       </w:r>
     </w:p>
     <w:p>
@@ -273,13 +287,13 @@
           <w:bCs/>
           <w:b/>
         </w:rPr>
-        <w:t xml:space="preserve">Integrated (API-driven)</w:t>
+        <w:t xml:space="preserve">Custom workflow</w:t>
       </w:r>
       <w:r>
         <w:t xml:space="preserve"> </w:t>
       </w:r>
       <w:r>
-        <w:t xml:space="preserve">— build your own prescribing UI on Medplum’s FHIR operations and bots; only the final, regulation-required</w:t>
+        <w:t xml:space="preserve">— prescribe from the chart using Medplum’s FHIR operations and bots. Only the final, regulation-required</w:t>
       </w:r>
       <w:r>
         <w:t xml:space="preserve"> </w:t>
@@ -319,7 +333,7 @@
           <w:iCs/>
           <w:i/>
         </w:rPr>
-        <w:t xml:space="preserve">Why: the core build-vs-UX trade-off. The iframe is fastest to live but UX is fixed and you generally can’t prescribe from inside your own chart. Integrated lets you own the workflow and prescribe in context, at the cost of building it. See 3.1.</w:t>
+        <w:t xml:space="preserve">Why: the iframe is fastest to live, and the steps stay the vendor’s. A custom workflow keeps prescribing in the chart. Presets — clinic favorites and order sets — standardize repeat orders on either path. Either way, transmission stays on the vendor’s review-and-send step. See 3.1.</w:t>
       </w:r>
     </w:p>
     <w:p>
@@ -469,7 +483,7 @@
         <w:pStyle w:val="Compact"/>
       </w:pPr>
       <w:r>
-        <w:t xml:space="preserve">Any offshore or non-US staff using the prescribing UI?</w:t>
+        <w:t xml:space="preserve">Any offshore or non-US staff using e-prescribing?</w:t>
       </w:r>
     </w:p>
     <w:p>
@@ -511,7 +525,7 @@
           <w:iCs/>
           <w:i/>
         </w:rPr>
-        <w:t xml:space="preserve">— a SureScripts-network constraint, not a Medplum one — so non-US staff can only hold non-prescribing roles, and even those must be enrolled with the vendor to call pharmacy or medication-history operations (3.3). Confirm your vendor’s policy on non-US users before designing an offshore-staffing model around the prescribing UI.</w:t>
+        <w:t xml:space="preserve">— a SureScripts-network constraint, not a Medplum one — so non-US staff can only hold non-prescribing roles, and even those must be enrolled with the vendor to call pharmacy or medication-history operations (3.3). Confirm your vendor’s policy on non-US users before designing an offshore-staffing model around e-prescribing.</w:t>
       </w:r>
     </w:p>
     <w:p>
@@ -521,8 +535,8 @@
         </w:pict>
       </w:r>
     </w:p>
-    <w:bookmarkEnd w:id="24"/>
-    <w:bookmarkStart w:id="25" w:name="section-2-feature-scoping"/>
+    <w:bookmarkEnd w:id="25"/>
+    <w:bookmarkStart w:id="26" w:name="section-2-feature-scoping"/>
     <w:p>
       <w:pPr>
         <w:pStyle w:val="Heading2"/>
@@ -694,7 +708,7 @@
               <w:jc w:val="left"/>
             </w:pPr>
             <w:r>
-              <w:t xml:space="preserve">Integration model (hosted iframe vs. integrated/API)</w:t>
+              <w:t xml:space="preserve">Custom workflow</w:t>
             </w:r>
           </w:p>
         </w:tc>
@@ -1627,8 +1641,8 @@
         </w:pict>
       </w:r>
     </w:p>
-    <w:bookmarkEnd w:id="25"/>
-    <w:bookmarkStart w:id="44" w:name="section-3-feature-deep-dives"/>
+    <w:bookmarkEnd w:id="26"/>
+    <w:bookmarkStart w:id="45" w:name="section-3-feature-deep-dives"/>
     <w:p>
       <w:pPr>
         <w:pStyle w:val="Heading2"/>
@@ -1937,7 +1951,7 @@
         </w:pict>
       </w:r>
     </w:p>
-    <w:bookmarkStart w:id="29" w:name="foundations"/>
+    <w:bookmarkStart w:id="30" w:name="foundations"/>
     <w:p>
       <w:pPr>
         <w:pStyle w:val="Heading3"/>
@@ -1946,13 +1960,13 @@
         <w:t xml:space="preserve">Foundations</w:t>
       </w:r>
     </w:p>
-    <w:bookmarkStart w:id="26" w:name="integration-model"/>
+    <w:bookmarkStart w:id="27" w:name="custom-workflow"/>
     <w:p>
       <w:pPr>
         <w:pStyle w:val="Heading4"/>
       </w:pPr>
       <w:r>
-        <w:t xml:space="preserve">3.1 Integration Model</w:t>
+        <w:t xml:space="preserve">3.1 Custom Workflow</w:t>
       </w:r>
     </w:p>
     <w:p>
@@ -1960,7 +1974,7 @@
         <w:pStyle w:val="FirstParagraph"/>
       </w:pPr>
       <w:r>
-        <w:t xml:space="preserve">How much of the prescribing UI you build — the decision that shapes almost every section below.</w:t>
+        <w:t xml:space="preserve">Whether prescribing follows the vendor’s hosted flow or a custom workflow in the chart. This choice shapes almost every section below.</w:t>
       </w:r>
     </w:p>
     <w:p>
@@ -1984,23 +1998,7 @@
         <w:pStyle w:val="Compact"/>
       </w:pPr>
       <w:r>
-        <w:t xml:space="preserve">Do prescribers need to write prescriptions</w:t>
-      </w:r>
-      <w:r>
-        <w:t xml:space="preserve"> </w:t>
-      </w:r>
-      <w:r>
-        <w:rPr>
-          <w:iCs/>
-          <w:i/>
-        </w:rPr>
-        <w:t xml:space="preserve">in context</w:t>
-      </w:r>
-      <w:r>
-        <w:t xml:space="preserve"> </w:t>
-      </w:r>
-      <w:r>
-        <w:t xml:space="preserve">(from inside your chart), or is a standalone screen fine?</w:t>
+        <w:t xml:space="preserve">Do prescribers write prescriptions from inside the chart, or is the vendor’s hosted flow enough?</w:t>
       </w:r>
     </w:p>
     <w:p>
@@ -2012,7 +2010,7 @@
         <w:pStyle w:val="Compact"/>
       </w:pPr>
       <w:r>
-        <w:t xml:space="preserve">How much engineering do you want to invest in the prescribing UI, now and ongoing?</w:t>
+        <w:t xml:space="preserve">Do you want presets — clinic favorites and order sets — for medications the practice sends often?</w:t>
       </w:r>
     </w:p>
     <w:p>
@@ -2024,7 +2022,7 @@
         <w:pStyle w:val="Compact"/>
       </w:pPr>
       <w:r>
-        <w:t xml:space="preserve">Do you need to control the look and steps of the flow, or is a vendor-standard flow acceptable?</w:t>
+        <w:t xml:space="preserve">Is the vendor’s standard sequence of steps acceptable?</w:t>
       </w:r>
     </w:p>
     <w:tbl>
@@ -2036,8 +2034,8 @@
         <w:tblLayout w:type="fixed"/>
       </w:tblPr>
       <w:tblGrid>
-        <w:gridCol w:w="4426"/>
-        <w:gridCol w:w="4934"/>
+        <w:gridCol w:w="3645"/>
+        <w:gridCol w:w="5715"/>
       </w:tblGrid>
       <w:tr>
         <w:trPr>
@@ -2081,7 +2079,7 @@
               <w:jc w:val="left"/>
             </w:pPr>
             <w:r>
-              <w:t xml:space="preserve">Standalone screen fine; minimal build</w:t>
+              <w:t xml:space="preserve">Hosted flow is enough</w:t>
             </w:r>
           </w:p>
         </w:tc>
@@ -2103,24 +2101,24 @@
               <w:t xml:space="preserve"> </w:t>
             </w:r>
             <w:r>
-              <w:t xml:space="preserve">— the vendor’s prescribing UI, embedded. Fastest to live; UX is fixed and not customizable.</w:t>
-            </w:r>
-          </w:p>
-        </w:tc>
-      </w:tr>
-      <w:tr>
-        <w:trPr>
-          <w:cantSplit/>
-        </w:trPr>
-        <w:tc>
-          <w:tcPr/>
-          <w:p>
-            <w:pPr>
-              <w:pStyle w:val="Compact"/>
-              <w:jc w:val="left"/>
-            </w:pPr>
-            <w:r>
-              <w:t xml:space="preserve">Must prescribe from within your own chart</w:t>
+              <w:t xml:space="preserve">— the vendor’s screens, embedded. Fastest to live; the steps are the vendor’s.</w:t>
+            </w:r>
+          </w:p>
+        </w:tc>
+      </w:tr>
+      <w:tr>
+        <w:trPr>
+          <w:cantSplit/>
+        </w:trPr>
+        <w:tc>
+          <w:tcPr/>
+          <w:p>
+            <w:pPr>
+              <w:pStyle w:val="Compact"/>
+              <w:jc w:val="left"/>
+            </w:pPr>
+            <w:r>
+              <w:t xml:space="preserve">Prescribe from the chart</w:t>
             </w:r>
           </w:p>
         </w:tc>
@@ -2136,30 +2134,30 @@
                 <w:bCs/>
                 <w:b/>
               </w:rPr>
-              <w:t xml:space="preserve">Integrated (API-driven)</w:t>
-            </w:r>
-            <w:r>
-              <w:t xml:space="preserve"> </w:t>
-            </w:r>
-            <w:r>
-              <w:t xml:space="preserve">— build the pre-approval flow on FHIR operations and bots; the prescriber stays in your UI until the final send.</w:t>
-            </w:r>
-          </w:p>
-        </w:tc>
-      </w:tr>
-      <w:tr>
-        <w:trPr>
-          <w:cantSplit/>
-        </w:trPr>
-        <w:tc>
-          <w:tcPr/>
-          <w:p>
-            <w:pPr>
-              <w:pStyle w:val="Compact"/>
-              <w:jc w:val="left"/>
-            </w:pPr>
-            <w:r>
-              <w:t xml:space="preserve">Own the branding and steps</w:t>
+              <w:t xml:space="preserve">Custom workflow</w:t>
+            </w:r>
+            <w:r>
+              <w:t xml:space="preserve"> </w:t>
+            </w:r>
+            <w:r>
+              <w:t xml:space="preserve">— stage the order with FHIR operations and bots; the prescriber stays in the chart until the final send.</w:t>
+            </w:r>
+          </w:p>
+        </w:tc>
+      </w:tr>
+      <w:tr>
+        <w:trPr>
+          <w:cantSplit/>
+        </w:trPr>
+        <w:tc>
+          <w:tcPr/>
+          <w:p>
+            <w:pPr>
+              <w:pStyle w:val="Compact"/>
+              <w:jc w:val="left"/>
+            </w:pPr>
+            <w:r>
+              <w:t xml:space="preserve">Repeat medications</w:t>
             </w:r>
           </w:p>
         </w:tc>
@@ -2175,42 +2173,42 @@
                 <w:bCs/>
                 <w:b/>
               </w:rPr>
-              <w:t xml:space="preserve">Integrated</w:t>
-            </w:r>
-            <w:r>
-              <w:t xml:space="preserve"> </w:t>
-            </w:r>
-            <w:r>
-              <w:t xml:space="preserve">— you control everything up to the vendor-hosted review-and-send widget (stylable; transmitted content is not).</w:t>
-            </w:r>
-          </w:p>
-        </w:tc>
-      </w:tr>
-      <w:tr>
-        <w:trPr>
-          <w:cantSplit/>
-        </w:trPr>
-        <w:tc>
-          <w:tcPr/>
-          <w:p>
-            <w:pPr>
-              <w:pStyle w:val="Compact"/>
-              <w:jc w:val="left"/>
-            </w:pPr>
-            <w:r>
-              <w:t xml:space="preserve">Either model</w:t>
-            </w:r>
-          </w:p>
-        </w:tc>
-        <w:tc>
-          <w:tcPr/>
-          <w:p>
-            <w:pPr>
-              <w:pStyle w:val="Compact"/>
-              <w:jc w:val="left"/>
-            </w:pPr>
-            <w:r>
-              <w:t xml:space="preserve">The final review-and-send step is always vendor-hosted and compliance-controlled — neither model replaces the moment of transmission with your own code.</w:t>
+              <w:t xml:space="preserve">Presets</w:t>
+            </w:r>
+            <w:r>
+              <w:t xml:space="preserve"> </w:t>
+            </w:r>
+            <w:r>
+              <w:t xml:space="preserve">— clinic favorites and order sets (3.7). These are configuration, not a separate prescribing interface.</w:t>
+            </w:r>
+          </w:p>
+        </w:tc>
+      </w:tr>
+      <w:tr>
+        <w:trPr>
+          <w:cantSplit/>
+        </w:trPr>
+        <w:tc>
+          <w:tcPr/>
+          <w:p>
+            <w:pPr>
+              <w:pStyle w:val="Compact"/>
+              <w:jc w:val="left"/>
+            </w:pPr>
+            <w:r>
+              <w:t xml:space="preserve">Either path</w:t>
+            </w:r>
+          </w:p>
+        </w:tc>
+        <w:tc>
+          <w:tcPr/>
+          <w:p>
+            <w:pPr>
+              <w:pStyle w:val="Compact"/>
+              <w:jc w:val="left"/>
+            </w:pPr>
+            <w:r>
+              <w:t xml:space="preserve">The final review-and-send step is always vendor-hosted and compliance-controlled. A custom workflow does not replace transmission.</w:t>
             </w:r>
           </w:p>
         </w:tc>
@@ -2231,29 +2229,11 @@
         <w:t xml:space="preserve"> </w:t>
       </w:r>
       <w:r>
-        <w:t xml:space="preserve">This is expensive to reverse — it determines whether you build a prescribing UI at all, whether</w:t>
-      </w:r>
-      <w:r>
-        <w:t xml:space="preserve"> </w:t>
-      </w:r>
-      <w:r>
-        <w:t xml:space="preserve">“</w:t>
-      </w:r>
-      <w:r>
-        <w:t xml:space="preserve">prescribe from the chart</w:t>
-      </w:r>
-      <w:r>
-        <w:t xml:space="preserve">”</w:t>
-      </w:r>
-      <w:r>
-        <w:t xml:space="preserve"> </w:t>
-      </w:r>
-      <w:r>
-        <w:t xml:space="preserve">is possible, and how enrollment and favorites surface. Align on 1.2 before committing engineering.</w:t>
-      </w:r>
-    </w:p>
-    <w:bookmarkEnd w:id="26"/>
-    <w:bookmarkStart w:id="27" w:name="prescriber-enrollment-identity-proofing"/>
+        <w:t xml:space="preserve">This is expensive to reverse — it determines whether prescribers stay in the chart, and how enrollment and presets surface. Align on 1.2 before you commit to a workflow.</w:t>
+      </w:r>
+    </w:p>
+    <w:bookmarkEnd w:id="27"/>
+    <w:bookmarkStart w:id="28" w:name="prescriber-enrollment-identity-proofing"/>
     <w:p>
       <w:pPr>
         <w:pStyle w:val="Heading4"/>
@@ -2497,8 +2477,8 @@
         </w:tc>
       </w:tr>
     </w:tbl>
-    <w:bookmarkEnd w:id="27"/>
-    <w:bookmarkStart w:id="28" w:name="provider-practice-identity-data"/>
+    <w:bookmarkEnd w:id="28"/>
+    <w:bookmarkStart w:id="29" w:name="provider-practice-identity-data"/>
     <w:p>
       <w:pPr>
         <w:pStyle w:val="Heading4"/>
@@ -2957,9 +2937,9 @@
         </w:pict>
       </w:r>
     </w:p>
-    <w:bookmarkEnd w:id="28"/>
     <w:bookmarkEnd w:id="29"/>
-    <w:bookmarkStart w:id="31" w:name="controlled-substances"/>
+    <w:bookmarkEnd w:id="30"/>
+    <w:bookmarkStart w:id="32" w:name="controlled-substances"/>
     <w:p>
       <w:pPr>
         <w:pStyle w:val="Heading3"/>
@@ -2980,7 +2960,7 @@
         <w:t xml:space="preserve">Read only if 1.1 includes controlled substances. Otherwise skip to 3.5.</w:t>
       </w:r>
     </w:p>
-    <w:bookmarkStart w:id="30" w:name="X3c9097b3ec9267039151118ddc1c4b6701b8af1"/>
+    <w:bookmarkStart w:id="31" w:name="X3c9097b3ec9267039151118ddc1c4b6701b8af1"/>
     <w:p>
       <w:pPr>
         <w:pStyle w:val="Heading4"/>
@@ -3279,9 +3259,9 @@
         </w:pict>
       </w:r>
     </w:p>
-    <w:bookmarkEnd w:id="30"/>
     <w:bookmarkEnd w:id="31"/>
-    <w:bookmarkStart w:id="38" w:name="prescribing-workflow"/>
+    <w:bookmarkEnd w:id="32"/>
+    <w:bookmarkStart w:id="39" w:name="prescribing-workflow"/>
     <w:p>
       <w:pPr>
         <w:pStyle w:val="Heading3"/>
@@ -3290,7 +3270,7 @@
         <w:t xml:space="preserve">Prescribing Workflow</w:t>
       </w:r>
     </w:p>
-    <w:bookmarkStart w:id="34" w:name="X7d643f3c56220bea268c9eb469439065dc34bfa"/>
+    <w:bookmarkStart w:id="35" w:name="X7d643f3c56220bea268c9eb469439065dc34bfa"/>
     <w:p>
       <w:pPr>
         <w:pStyle w:val="Heading4"/>
@@ -3532,7 +3512,7 @@
             <w:r>
               <w:t xml:space="preserve"> </w:t>
             </w:r>
-            <w:hyperlink r:id="rId32">
+            <w:hyperlink r:id="rId33">
               <w:r>
                 <w:rPr>
                   <w:rStyle w:val="Hyperlink"/>
@@ -3633,7 +3613,7 @@
             <w:r>
               <w:t xml:space="preserve"> </w:t>
             </w:r>
-            <w:hyperlink r:id="rId33">
+            <w:hyperlink r:id="rId34">
               <w:r>
                 <w:rPr>
                   <w:rStyle w:val="Hyperlink"/>
@@ -3648,8 +3628,8 @@
         </w:tc>
       </w:tr>
     </w:tbl>
-    <w:bookmarkEnd w:id="34"/>
-    <w:bookmarkStart w:id="35" w:name="refills-reorders-discontinuation"/>
+    <w:bookmarkEnd w:id="35"/>
+    <w:bookmarkStart w:id="36" w:name="refills-reorders-discontinuation"/>
     <w:p>
       <w:pPr>
         <w:pStyle w:val="Heading4"/>
@@ -3844,8 +3824,8 @@
         </w:tc>
       </w:tr>
     </w:tbl>
-    <w:bookmarkEnd w:id="35"/>
-    <w:bookmarkStart w:id="36" w:name="Xa573f0c6640e2e14ff1a171870ed2e08206db46"/>
+    <w:bookmarkEnd w:id="36"/>
+    <w:bookmarkStart w:id="37" w:name="Xa573f0c6640e2e14ff1a171870ed2e08206db46"/>
     <w:p>
       <w:pPr>
         <w:pStyle w:val="Heading4"/>
@@ -4052,8 +4032,8 @@
         </w:tc>
       </w:tr>
     </w:tbl>
-    <w:bookmarkEnd w:id="36"/>
-    <w:bookmarkStart w:id="37" w:name="medication-history"/>
+    <w:bookmarkEnd w:id="37"/>
+    <w:bookmarkStart w:id="38" w:name="medication-history"/>
     <w:p>
       <w:pPr>
         <w:pStyle w:val="Heading4"/>
@@ -4301,9 +4281,9 @@
         </w:pict>
       </w:r>
     </w:p>
-    <w:bookmarkEnd w:id="37"/>
     <w:bookmarkEnd w:id="38"/>
-    <w:bookmarkStart w:id="41" w:name="practice-structure"/>
+    <w:bookmarkEnd w:id="39"/>
+    <w:bookmarkStart w:id="42" w:name="practice-structure"/>
     <w:p>
       <w:pPr>
         <w:pStyle w:val="Heading3"/>
@@ -4312,7 +4292,7 @@
         <w:t xml:space="preserve">Practice Structure</w:t>
       </w:r>
     </w:p>
-    <w:bookmarkStart w:id="39" w:name="Xe60e968d4b09eed86bb30803009999c39481e86"/>
+    <w:bookmarkStart w:id="40" w:name="Xe60e968d4b09eed86bb30803009999c39481e86"/>
     <w:p>
       <w:pPr>
         <w:pStyle w:val="Heading4"/>
@@ -4593,8 +4573,8 @@
         </w:tc>
       </w:tr>
     </w:tbl>
-    <w:bookmarkEnd w:id="39"/>
-    <w:bookmarkStart w:id="40" w:name="multi-tenant-platform-deployments"/>
+    <w:bookmarkEnd w:id="40"/>
+    <w:bookmarkStart w:id="41" w:name="multi-tenant-platform-deployments"/>
     <w:p>
       <w:pPr>
         <w:pStyle w:val="Heading4"/>
@@ -4879,13 +4859,13 @@
                 <w:bCs/>
                 <w:b/>
               </w:rPr>
-              <w:t xml:space="preserve">integrated</w:t>
-            </w:r>
-            <w:r>
-              <w:t xml:space="preserve"> </w:t>
-            </w:r>
-            <w:r>
-              <w:t xml:space="preserve">path can grant client admins access scoped to their own tenant (cross-tenant admin access is blocked for HIPAA); the</w:t>
+              <w:t xml:space="preserve">custom workflow</w:t>
+            </w:r>
+            <w:r>
+              <w:t xml:space="preserve"> </w:t>
+            </w:r>
+            <w:r>
+              <w:t xml:space="preserve">can grant client admins access scoped to their own tenant (cross-tenant admin access is blocked for HIPAA); the</w:t>
             </w:r>
             <w:r>
               <w:t xml:space="preserve"> </w:t>
@@ -4943,9 +4923,9 @@
         </w:pict>
       </w:r>
     </w:p>
-    <w:bookmarkEnd w:id="40"/>
     <w:bookmarkEnd w:id="41"/>
-    <w:bookmarkStart w:id="43" w:name="situational"/>
+    <w:bookmarkEnd w:id="42"/>
+    <w:bookmarkStart w:id="44" w:name="situational"/>
     <w:p>
       <w:pPr>
         <w:pStyle w:val="Heading3"/>
@@ -4954,7 +4934,7 @@
         <w:t xml:space="preserve">Situational</w:t>
       </w:r>
     </w:p>
-    <w:bookmarkStart w:id="42" w:name="Xc05e7dc0a018fe694ee587ad8dfd07f5ff84d89"/>
+    <w:bookmarkStart w:id="43" w:name="Xc05e7dc0a018fe694ee587ad8dfd07f5ff84d89"/>
     <w:p>
       <w:pPr>
         <w:pStyle w:val="Heading4"/>
@@ -5172,10 +5152,10 @@
         </w:pict>
       </w:r>
     </w:p>
-    <w:bookmarkEnd w:id="42"/>
     <w:bookmarkEnd w:id="43"/>
     <w:bookmarkEnd w:id="44"/>
-    <w:bookmarkStart w:id="48" w:name="related-integrations"/>
+    <w:bookmarkEnd w:id="45"/>
+    <w:bookmarkStart w:id="49" w:name="related-integrations"/>
     <w:p>
       <w:pPr>
         <w:pStyle w:val="Heading2"/>
@@ -5200,7 +5180,7 @@
         </w:numPr>
         <w:pStyle w:val="Compact"/>
       </w:pPr>
-      <w:hyperlink r:id="rId45">
+      <w:hyperlink r:id="rId46">
         <w:r>
           <w:rPr>
             <w:rStyle w:val="Hyperlink"/>
@@ -5214,7 +5194,7 @@
         <w:t xml:space="preserve"> </w:t>
       </w:r>
       <w:r>
-        <w:t xml:space="preserve">— full API surface with custom FHIR operations and bots, plus an authenticated iframe. The option behind the</w:t>
+        <w:t xml:space="preserve">— FHIR operations and bots, plus an authenticated iframe. The option behind the</w:t>
       </w:r>
       <w:r>
         <w:t xml:space="preserve"> </w:t>
@@ -5224,13 +5204,13 @@
           <w:bCs/>
           <w:b/>
         </w:rPr>
-        <w:t xml:space="preserve">integrated (API-driven)</w:t>
+        <w:t xml:space="preserve">custom workflow</w:t>
       </w:r>
       <w:r>
         <w:t xml:space="preserve"> </w:t>
       </w:r>
       <w:r>
-        <w:t xml:space="preserve">model in 3.1.</w:t>
+        <w:t xml:space="preserve">in 3.1.</w:t>
       </w:r>
     </w:p>
     <w:p>
@@ -5241,7 +5221,7 @@
         </w:numPr>
         <w:pStyle w:val="Compact"/>
       </w:pPr>
-      <w:hyperlink r:id="rId46">
+      <w:hyperlink r:id="rId47">
         <w:r>
           <w:rPr>
             <w:rStyle w:val="Hyperlink"/>
@@ -5260,7 +5240,7 @@
       <w:r>
         <w:t xml:space="preserve"> </w:t>
       </w:r>
-      <w:hyperlink r:id="rId47">
+      <w:hyperlink r:id="rId48">
         <w:r>
           <w:rPr>
             <w:rStyle w:val="Hyperlink"/>
@@ -5275,8 +5255,8 @@
         <w:t xml:space="preserve">(3.2).</w:t>
       </w:r>
     </w:p>
-    <w:bookmarkEnd w:id="48"/>
     <w:bookmarkEnd w:id="49"/>
+    <w:bookmarkEnd w:id="50"/>
     <w:sectPr>
       <w:pgSz w:h="15840" w:w="12240"/>
       <w:pgMar w:bottom="1440" w:footer="720" w:gutter="0" w:header="720" w:left="1440" w:right="1440" w:top="1440"/>

</xml_diff>